<commit_message>
Rename CloudSphere application and monitoring identifiers
</commit_message>
<xml_diff>
--- a/docs/Internal_Monitoring_Observability_Project_Report.docx
+++ b/docs/Internal_Monitoring_Observability_Project_Report.docx
@@ -268,7 +268,7 @@
           <w:color w:val="0B2545"/>
           <w:sz w:val="22"/>
         </w:rPr>
-        <w:t>Terraform provisions two Ubuntu virtual machines in one secured Azure virtual network. A dedicated GitLab VM hosts self-managed GitLab Community Edition and its persistent repositories, configuration, and logs. A separate monitoring VM hosts GitLab Runner, Prometheus, Grafana, Alertmanager, exporters, and an instrumented Python demonstration application. Docker Compose manages both service groups, while Bash and cloud-init automate installation and lifecycle tasks.</w:t>
+        <w:t>Terraform provisions two Ubuntu virtual machines in one secured Azure virtual network. A dedicated GitLab VM hosts self-managed GitLab Community Edition and its persistent repositories, configuration, and logs. A separate monitoring VM hosts GitLab Runner, Prometheus, Grafana, Alertmanager, exporters, and an instrumented Python operations application. Docker Compose manages both service groups, while Bash and cloud-init automate installation and lifecycle tasks.</w:t>
       </w:r>
     </w:p>
     <w:p>
@@ -516,7 +516,7 @@
           <w:color w:val="0B2545"/>
           <w:sz w:val="22"/>
         </w:rPr>
-        <w:t>Safer demonstrations:</w:t>
+        <w:t>Safer presentations:</w:t>
       </w:r>
       <w:r>
         <w:rPr>
@@ -525,7 +525,7 @@
           <w:color w:val="0B2545"/>
           <w:sz w:val="22"/>
         </w:rPr>
-        <w:t xml:space="preserve"> generated passwords, restricted Azure CIDRs, private metric interfaces, and a resettable demo workload avoid exposing real secrets or business data.</w:t>
+        <w:t xml:space="preserve"> generated passwords, restricted Azure CIDRs, private metric interfaces, and a resettable lab workload avoid exposing real secrets or business data.</w:t>
       </w:r>
     </w:p>
     <w:p>
@@ -1833,7 +1833,7 @@
                 <w:color w:val="0B2545"/>
                 <w:sz w:val="18"/>
               </w:rPr>
-              <w:t>Python demo app</w:t>
+              <w:t>Python CloudSphere app</w:t>
             </w:r>
           </w:p>
         </w:tc>
@@ -2055,7 +2055,7 @@
           <w:color w:val="0B2545"/>
           <w:sz w:val="22"/>
         </w:rPr>
-        <w:t>Demonstrate branches, commit history, merge requests, review, and a protected default branch.</w:t>
+        <w:t>Show branches, commit history, merge requests, review, and a protected default branch.</w:t>
       </w:r>
     </w:p>
     <w:p>
@@ -2091,7 +2091,7 @@
           <w:color w:val="0B2545"/>
           <w:sz w:val="22"/>
         </w:rPr>
-        <w:t>Monitor GitLab, Runner, both hosts, containers, endpoints, the demo application, and business metrics.</w:t>
+        <w:t>Monitor GitLab, Runner, both hosts, containers, endpoints, the CloudSphere application, and business metrics.</w:t>
       </w:r>
     </w:p>
     <w:p>
@@ -3387,7 +3387,7 @@
                 <w:color w:val="0B2545"/>
                 <w:sz w:val="18"/>
               </w:rPr>
-              <w:t>Exporters and demo app</w:t>
+              <w:t>Exporters and CloudSphere app</w:t>
             </w:r>
           </w:p>
         </w:tc>
@@ -3443,7 +3443,7 @@
                 <w:color w:val="0B2545"/>
                 <w:sz w:val="18"/>
               </w:rPr>
-              <w:t>Private Docker network; demo endpoint loopback 8000.</w:t>
+              <w:t>Private Docker network; application endpoint loopback 8000.</w:t>
             </w:r>
           </w:p>
         </w:tc>
@@ -4395,7 +4395,7 @@
           <w:color w:val="0B2545"/>
           <w:sz w:val="22"/>
         </w:rPr>
-        <w:t>Prometheus scrapes itself, the monitoring host, containers, the demo application, Blackbox Exporter, GitLab application metrics, GitLab host Node Exporter, GitLab Runner metrics, GitLab health, and local service health. File-based service discovery receives the GitLab private IP from Terraform outputs, so the monitoring configuration remains version controlled without hard-coding an environment address.</w:t>
+        <w:t>Prometheus scrapes itself, the monitoring host, containers, the CloudSphere application, Blackbox Exporter, GitLab application metrics, GitLab host Node Exporter, GitLab Runner metrics, GitLab health, and local service health. File-based service discovery receives the GitLab private IP from Terraform outputs, so the monitoring configuration remains version controlled without hard-coding an environment address.</w:t>
       </w:r>
     </w:p>
     <w:p>
@@ -4406,7 +4406,7 @@
           <w:color w:val="0B2545"/>
           <w:sz w:val="22"/>
         </w:rPr>
-        <w:t>The Operations Overview dashboard shows availability, host capacity, container use, request status, orders, revenue, inventory, and alerts. The GitLab Platform Health dashboard shows GitLab and Runner availability, scrape duration, sample volume, GitLab host CPU/memory/disk signals, and endpoint state. Business counters can be changed during the demonstration and reset to their initial values with one controlled request.</w:t>
+        <w:t>The Operations Overview dashboard shows availability, host capacity, container use, request status, orders, revenue, inventory, and alerts. The GitLab Platform Health dashboard shows GitLab and Runner availability, scrape duration, sample volume, GitLab host CPU/memory/disk signals, and endpoint state. Business counters can be changed during the presentation and reset to their initial values with one controlled request.</w:t>
       </w:r>
     </w:p>
     <w:p>
@@ -4568,7 +4568,7 @@
           <w:color w:val="0B2545"/>
           <w:sz w:val="22"/>
         </w:rPr>
-        <w:t>Prometheus, Alertmanager, Runner metrics, demo endpoints, and cross-VM monitoring targets are not publicly exposed.</w:t>
+        <w:t>Prometheus, Alertmanager, Runner metrics, application endpoints, and cross-VM monitoring targets are not publicly exposed.</w:t>
       </w:r>
     </w:p>
     <w:p>
@@ -4859,7 +4859,7 @@
         <w:keepNext/>
       </w:pPr>
       <w:r>
-        <w:t>7. Implementation Demonstration</w:t>
+        <w:t>7. Implementation Walkthrough</w:t>
       </w:r>
     </w:p>
     <w:p>
@@ -4870,7 +4870,7 @@
           <w:color w:val="0B2545"/>
           <w:sz w:val="22"/>
         </w:rPr>
-        <w:t>The demonstration should show the complete workflow, not only open browser tabs. Passwords, tokens, private keys, public IPs, and unrelated accounts must be hidden from the audience.</w:t>
+        <w:t>The presentation should show the complete workflow, not only open browser tabs. Passwords, tokens, private keys, public IPs, and unrelated accounts must be hidden from the audience.</w:t>
       </w:r>
     </w:p>
     <w:p>
@@ -4996,7 +4996,7 @@
           <w:color w:val="0B2545"/>
           <w:sz w:val="22"/>
         </w:rPr>
-        <w:t>Open Prometheus targets through the SSH tunnel and show GitLab, GitLab host, Runner, both hosts, containers, endpoint probes, and the demo application as UP.</w:t>
+        <w:t>Open Prometheus targets through the SSH tunnel and show GitLab, GitLab host, Runner, both hosts, containers, endpoint probes, and the CloudSphere application as UP.</w:t>
       </w:r>
     </w:p>
     <w:p>
@@ -5050,7 +5050,7 @@
           <w:color w:val="0B2545"/>
           <w:sz w:val="22"/>
         </w:rPr>
-        <w:t>Explain an alert rule and, if presentation time permits, stop a noncritical service long enough to demonstrate firing and resolved states.</w:t>
+        <w:t>Explain an alert rule and, if presentation time permits, stop a noncritical service long enough to show firing and resolved states.</w:t>
       </w:r>
     </w:p>
     <w:p>
@@ -5341,7 +5341,7 @@
           <w:color w:val="0B2545"/>
           <w:sz w:val="21"/>
         </w:rPr>
-        <w:t>Never demonstrate restore or terraform destroy in front of an audience. Restoration can replace live data, and teardown deletes the entire Azure resource group after explicit confirmation.</w:t>
+        <w:t>Never run restore or terraform destroy in front of an audience. Restoration can replace live data, and teardown deletes the entire Azure resource group after explicit confirmation.</w:t>
       </w:r>
     </w:p>
     <w:p>
@@ -7163,7 +7163,7 @@
                 <w:color w:val="0B2545"/>
                 <w:sz w:val="18"/>
               </w:rPr>
-              <w:t>Implemented for demo</w:t>
+              <w:t>Implemented for presentation</w:t>
             </w:r>
           </w:p>
         </w:tc>
@@ -7221,7 +7221,7 @@
                 <w:color w:val="0B2545"/>
                 <w:sz w:val="18"/>
               </w:rPr>
-              <w:t>Architecture, GitLab guide, security review, runbook, test plan, demo guide, and report.</w:t>
+              <w:t>Architecture, GitLab guide, security review, runbook, test plan, presentation guide, and report.</w:t>
             </w:r>
           </w:p>
         </w:tc>
@@ -7465,7 +7465,7 @@
                 <w:color w:val="0B2545"/>
                 <w:sz w:val="18"/>
               </w:rPr>
-              <w:t>Constrained two-vCPU GitLab demonstration VM</w:t>
+              <w:t>Constrained two-vCPU GitLab lab VM</w:t>
             </w:r>
           </w:p>
         </w:tc>
@@ -7985,7 +7985,7 @@
           <w:color w:val="0B2545"/>
           <w:sz w:val="22"/>
         </w:rPr>
-        <w:t>The completed design turns the original monitoring solution into a broader internal engineering platform. GitLab provides governed source control, collaboration, and CI/CD; Azure and Terraform make the environment repeatable; Docker Compose makes service operation consistent; Prometheus, Grafana, and Alertmanager make the platform observable; and the documented automation covers deployment, demonstration, reset, restart, backup, restoration, validation, and teardown.</w:t>
+        <w:t>The completed design turns the original monitoring solution into a broader internal engineering platform. GitLab provides governed source control, collaboration, and CI/CD; Azure and Terraform make the environment repeatable; Docker Compose makes service operation consistent; Prometheus, Grafana, and Alertmanager make the platform observable; and the documented automation covers deployment, presentation, reset, restart, backup, restoration, validation, and teardown.</w:t>
       </w:r>
     </w:p>
     <w:p>
@@ -8262,7 +8262,7 @@
                 <w:color w:val="0B2545"/>
                 <w:sz w:val="18"/>
               </w:rPr>
-              <w:t>Prometheus, Grafana, Alertmanager, exporters, Runner, demo app, dashboards, rules, and monitoring scripts.</w:t>
+              <w:t>Prometheus, Grafana, Alertmanager, exporters, Runner, CloudSphere app, dashboards, rules, and monitoring scripts.</w:t>
             </w:r>
           </w:p>
         </w:tc>
@@ -8436,7 +8436,7 @@
                 <w:color w:val="0B2545"/>
                 <w:sz w:val="18"/>
               </w:rPr>
-              <w:t>Architecture, GitLab guide, security review, runbook, test plan, demonstration guide, matrix, validation, and report.</w:t>
+              <w:t>Architecture, GitLab guide, security review, runbook, test plan, presentation guide, matrix, validation, and report.</w:t>
             </w:r>
           </w:p>
         </w:tc>
@@ -8494,7 +8494,7 @@
                 <w:color w:val="0B2545"/>
                 <w:sz w:val="18"/>
               </w:rPr>
-              <w:t>Project introduction, tool definitions, deployment, access, Runner, demonstration, reset, stop/start, and roadmap.</w:t>
+              <w:t>Project introduction, tool definitions, deployment, access, Runner, presentation, reset, stop/start, and roadmap.</w:t>
             </w:r>
           </w:p>
         </w:tc>

</xml_diff>

<commit_message>
Restyle GitLab dashboard for CloudSphere
</commit_message>
<xml_diff>
--- a/docs/Internal_Monitoring_Observability_Project_Report.docx
+++ b/docs/Internal_Monitoring_Observability_Project_Report.docx
@@ -4406,7 +4406,7 @@
           <w:color w:val="0B2545"/>
           <w:sz w:val="22"/>
         </w:rPr>
-        <w:t>The Operations Overview dashboard shows availability, host capacity, container use, request status, orders, revenue, inventory, and alerts. The GitLab Platform Health dashboard shows GitLab and Runner availability, scrape duration, sample volume, GitLab host CPU/memory/disk signals, and endpoint state. Business counters can be changed during the presentation and reset to their initial values with one controlled request.</w:t>
+        <w:t>The Operations Overview dashboard shows availability, host capacity, container use, request status, orders, revenue, inventory, and alerts. The CloudSphere — GitLab Control Plane dashboard shows GitLab and Runner availability, scrape duration, sample volume, GitLab host CPU/memory/disk signals, and endpoint state. Business counters can be changed during the presentation and reset to their initial values with one controlled request.</w:t>
       </w:r>
     </w:p>
     <w:p>
@@ -5014,7 +5014,7 @@
           <w:color w:val="0B2545"/>
           <w:sz w:val="22"/>
         </w:rPr>
-        <w:t>Open the Operations Overview and GitLab Platform Health Grafana dashboards.</w:t>
+        <w:t>Open the Operations Overview and CloudSphere — GitLab Control Plane Grafana dashboards.</w:t>
       </w:r>
     </w:p>
     <w:p>

</xml_diff>